<commit_message>
Automatização da criação do arquivo com as consultas
</commit_message>
<xml_diff>
--- a/outputs/2025/09setembro/Relatorio_Gerencial_Completo_2025-09.docx
+++ b/outputs/2025/09setembro/Relatorio_Gerencial_Completo_2025-09.docx
@@ -8419,7 +8419,7 @@
               <w:rPr>
                 <w:sz w:val="16"/>
               </w:rPr>
-              <w:t>SJPI</w:t>
+              <w:t>TREAL</w:t>
             </w:r>
           </w:p>
         </w:tc>
@@ -8476,26 +8476,26 @@
               <w:rPr>
                 <w:sz w:val="16"/>
               </w:rPr>
-              <w:t>72</w:t>
-            </w:r>
-          </w:p>
-        </w:tc>
-        <w:tc>
-          <w:tcPr>
-            <w:tcW w:type="dxa" w:w="1813"/>
-            <w:vAlign w:val="center"/>
-            <w:noWrap/>
-          </w:tcPr>
-          <w:p>
-            <w:pPr>
-              <w:spacing w:before="60" w:after="60"/>
-              <w:jc w:val="center"/>
-            </w:pPr>
-            <w:r>
-              <w:rPr>
-                <w:sz w:val="16"/>
-              </w:rPr>
-              <w:t>0,19%</w:t>
+              <w:t>37</w:t>
+            </w:r>
+          </w:p>
+        </w:tc>
+        <w:tc>
+          <w:tcPr>
+            <w:tcW w:type="dxa" w:w="1813"/>
+            <w:vAlign w:val="center"/>
+            <w:noWrap/>
+          </w:tcPr>
+          <w:p>
+            <w:pPr>
+              <w:spacing w:before="60" w:after="60"/>
+              <w:jc w:val="center"/>
+            </w:pPr>
+            <w:r>
+              <w:rPr>
+                <w:sz w:val="16"/>
+              </w:rPr>
+              <w:t>0,10%</w:t>
             </w:r>
           </w:p>
         </w:tc>
@@ -8807,7 +8807,7 @@
               <w:rPr>
                 <w:sz w:val="16"/>
               </w:rPr>
-              <w:t>TRT11</w:t>
+              <w:t>TRT17</w:t>
             </w:r>
           </w:p>
         </w:tc>
@@ -8864,26 +8864,26 @@
               <w:rPr>
                 <w:sz w:val="16"/>
               </w:rPr>
-              <w:t>270</w:t>
-            </w:r>
-          </w:p>
-        </w:tc>
-        <w:tc>
-          <w:tcPr>
-            <w:tcW w:type="dxa" w:w="1813"/>
-            <w:vAlign w:val="center"/>
-            <w:noWrap/>
-          </w:tcPr>
-          <w:p>
-            <w:pPr>
-              <w:spacing w:before="60" w:after="60"/>
-              <w:jc w:val="center"/>
-            </w:pPr>
-            <w:r>
-              <w:rPr>
-                <w:sz w:val="16"/>
-              </w:rPr>
-              <w:t>0,73%</w:t>
+              <w:t>223</w:t>
+            </w:r>
+          </w:p>
+        </w:tc>
+        <w:tc>
+          <w:tcPr>
+            <w:tcW w:type="dxa" w:w="1813"/>
+            <w:vAlign w:val="center"/>
+            <w:noWrap/>
+          </w:tcPr>
+          <w:p>
+            <w:pPr>
+              <w:spacing w:before="60" w:after="60"/>
+              <w:jc w:val="center"/>
+            </w:pPr>
+            <w:r>
+              <w:rPr>
+                <w:sz w:val="16"/>
+              </w:rPr>
+              <w:t>0,60%</w:t>
             </w:r>
           </w:p>
         </w:tc>
@@ -8904,7 +8904,7 @@
               <w:rPr>
                 <w:sz w:val="16"/>
               </w:rPr>
-              <w:t>TRETO</w:t>
+              <w:t>TRT14</w:t>
             </w:r>
           </w:p>
         </w:tc>
@@ -8961,26 +8961,26 @@
               <w:rPr>
                 <w:sz w:val="16"/>
               </w:rPr>
-              <w:t>64</w:t>
-            </w:r>
-          </w:p>
-        </w:tc>
-        <w:tc>
-          <w:tcPr>
-            <w:tcW w:type="dxa" w:w="1813"/>
-            <w:vAlign w:val="center"/>
-            <w:noWrap/>
-          </w:tcPr>
-          <w:p>
-            <w:pPr>
-              <w:spacing w:before="60" w:after="60"/>
-              <w:jc w:val="center"/>
-            </w:pPr>
-            <w:r>
-              <w:rPr>
-                <w:sz w:val="16"/>
-              </w:rPr>
-              <w:t>0,17%</w:t>
+              <w:t>265</w:t>
+            </w:r>
+          </w:p>
+        </w:tc>
+        <w:tc>
+          <w:tcPr>
+            <w:tcW w:type="dxa" w:w="1813"/>
+            <w:vAlign w:val="center"/>
+            <w:noWrap/>
+          </w:tcPr>
+          <w:p>
+            <w:pPr>
+              <w:spacing w:before="60" w:after="60"/>
+              <w:jc w:val="center"/>
+            </w:pPr>
+            <w:r>
+              <w:rPr>
+                <w:sz w:val="16"/>
+              </w:rPr>
+              <w:t>0,72%</w:t>
             </w:r>
           </w:p>
         </w:tc>
@@ -9001,7 +9001,7 @@
               <w:rPr>
                 <w:sz w:val="16"/>
               </w:rPr>
-              <w:t>TRT20</w:t>
+              <w:t>SJPA</w:t>
             </w:r>
           </w:p>
         </w:tc>
@@ -9058,26 +9058,26 @@
               <w:rPr>
                 <w:sz w:val="16"/>
               </w:rPr>
-              <w:t>82</w:t>
-            </w:r>
-          </w:p>
-        </w:tc>
-        <w:tc>
-          <w:tcPr>
-            <w:tcW w:type="dxa" w:w="1813"/>
-            <w:vAlign w:val="center"/>
-            <w:noWrap/>
-          </w:tcPr>
-          <w:p>
-            <w:pPr>
-              <w:spacing w:before="60" w:after="60"/>
-              <w:jc w:val="center"/>
-            </w:pPr>
-            <w:r>
-              <w:rPr>
-                <w:sz w:val="16"/>
-              </w:rPr>
-              <w:t>0,22%</w:t>
+              <w:t>126</w:t>
+            </w:r>
+          </w:p>
+        </w:tc>
+        <w:tc>
+          <w:tcPr>
+            <w:tcW w:type="dxa" w:w="1813"/>
+            <w:vAlign w:val="center"/>
+            <w:noWrap/>
+          </w:tcPr>
+          <w:p>
+            <w:pPr>
+              <w:spacing w:before="60" w:after="60"/>
+              <w:jc w:val="center"/>
+            </w:pPr>
+            <w:r>
+              <w:rPr>
+                <w:sz w:val="16"/>
+              </w:rPr>
+              <w:t>0,34%</w:t>
             </w:r>
           </w:p>
         </w:tc>
@@ -9098,7 +9098,7 @@
               <w:rPr>
                 <w:sz w:val="16"/>
               </w:rPr>
-              <w:t>TRT17</w:t>
+              <w:t>SJGO</w:t>
             </w:r>
           </w:p>
         </w:tc>
@@ -9155,26 +9155,26 @@
               <w:rPr>
                 <w:sz w:val="16"/>
               </w:rPr>
-              <w:t>223</w:t>
-            </w:r>
-          </w:p>
-        </w:tc>
-        <w:tc>
-          <w:tcPr>
-            <w:tcW w:type="dxa" w:w="1813"/>
-            <w:vAlign w:val="center"/>
-            <w:noWrap/>
-          </w:tcPr>
-          <w:p>
-            <w:pPr>
-              <w:spacing w:before="60" w:after="60"/>
-              <w:jc w:val="center"/>
-            </w:pPr>
-            <w:r>
-              <w:rPr>
-                <w:sz w:val="16"/>
-              </w:rPr>
-              <w:t>0,60%</w:t>
+              <w:t>108</w:t>
+            </w:r>
+          </w:p>
+        </w:tc>
+        <w:tc>
+          <w:tcPr>
+            <w:tcW w:type="dxa" w:w="1813"/>
+            <w:vAlign w:val="center"/>
+            <w:noWrap/>
+          </w:tcPr>
+          <w:p>
+            <w:pPr>
+              <w:spacing w:before="60" w:after="60"/>
+              <w:jc w:val="center"/>
+            </w:pPr>
+            <w:r>
+              <w:rPr>
+                <w:sz w:val="16"/>
+              </w:rPr>
+              <w:t>0,29%</w:t>
             </w:r>
           </w:p>
         </w:tc>
@@ -9195,7 +9195,7 @@
               <w:rPr>
                 <w:sz w:val="16"/>
               </w:rPr>
-              <w:t>TRT14</w:t>
+              <w:t>MPDFT</w:t>
             </w:r>
           </w:p>
         </w:tc>
@@ -9252,26 +9252,26 @@
               <w:rPr>
                 <w:sz w:val="16"/>
               </w:rPr>
-              <w:t>265</w:t>
-            </w:r>
-          </w:p>
-        </w:tc>
-        <w:tc>
-          <w:tcPr>
-            <w:tcW w:type="dxa" w:w="1813"/>
-            <w:vAlign w:val="center"/>
-            <w:noWrap/>
-          </w:tcPr>
-          <w:p>
-            <w:pPr>
-              <w:spacing w:before="60" w:after="60"/>
-              <w:jc w:val="center"/>
-            </w:pPr>
-            <w:r>
-              <w:rPr>
-                <w:sz w:val="16"/>
-              </w:rPr>
-              <w:t>0,72%</w:t>
+              <w:t>907</w:t>
+            </w:r>
+          </w:p>
+        </w:tc>
+        <w:tc>
+          <w:tcPr>
+            <w:tcW w:type="dxa" w:w="1813"/>
+            <w:vAlign w:val="center"/>
+            <w:noWrap/>
+          </w:tcPr>
+          <w:p>
+            <w:pPr>
+              <w:spacing w:before="60" w:after="60"/>
+              <w:jc w:val="center"/>
+            </w:pPr>
+            <w:r>
+              <w:rPr>
+                <w:sz w:val="16"/>
+              </w:rPr>
+              <w:t>2,45%</w:t>
             </w:r>
           </w:p>
         </w:tc>
@@ -9292,7 +9292,7 @@
               <w:rPr>
                 <w:sz w:val="16"/>
               </w:rPr>
-              <w:t>SJPA</w:t>
+              <w:t>TRETO</w:t>
             </w:r>
           </w:p>
         </w:tc>
@@ -9349,26 +9349,26 @@
               <w:rPr>
                 <w:sz w:val="16"/>
               </w:rPr>
-              <w:t>126</w:t>
-            </w:r>
-          </w:p>
-        </w:tc>
-        <w:tc>
-          <w:tcPr>
-            <w:tcW w:type="dxa" w:w="1813"/>
-            <w:vAlign w:val="center"/>
-            <w:noWrap/>
-          </w:tcPr>
-          <w:p>
-            <w:pPr>
-              <w:spacing w:before="60" w:after="60"/>
-              <w:jc w:val="center"/>
-            </w:pPr>
-            <w:r>
-              <w:rPr>
-                <w:sz w:val="16"/>
-              </w:rPr>
-              <w:t>0,34%</w:t>
+              <w:t>64</w:t>
+            </w:r>
+          </w:p>
+        </w:tc>
+        <w:tc>
+          <w:tcPr>
+            <w:tcW w:type="dxa" w:w="1813"/>
+            <w:vAlign w:val="center"/>
+            <w:noWrap/>
+          </w:tcPr>
+          <w:p>
+            <w:pPr>
+              <w:spacing w:before="60" w:after="60"/>
+              <w:jc w:val="center"/>
+            </w:pPr>
+            <w:r>
+              <w:rPr>
+                <w:sz w:val="16"/>
+              </w:rPr>
+              <w:t>0,17%</w:t>
             </w:r>
           </w:p>
         </w:tc>
@@ -9389,7 +9389,7 @@
               <w:rPr>
                 <w:sz w:val="16"/>
               </w:rPr>
-              <w:t>SJGO</w:t>
+              <w:t>TRT20</w:t>
             </w:r>
           </w:p>
         </w:tc>
@@ -9446,26 +9446,26 @@
               <w:rPr>
                 <w:sz w:val="16"/>
               </w:rPr>
-              <w:t>108</w:t>
-            </w:r>
-          </w:p>
-        </w:tc>
-        <w:tc>
-          <w:tcPr>
-            <w:tcW w:type="dxa" w:w="1813"/>
-            <w:vAlign w:val="center"/>
-            <w:noWrap/>
-          </w:tcPr>
-          <w:p>
-            <w:pPr>
-              <w:spacing w:before="60" w:after="60"/>
-              <w:jc w:val="center"/>
-            </w:pPr>
-            <w:r>
-              <w:rPr>
-                <w:sz w:val="16"/>
-              </w:rPr>
-              <w:t>0,29%</w:t>
+              <w:t>82</w:t>
+            </w:r>
+          </w:p>
+        </w:tc>
+        <w:tc>
+          <w:tcPr>
+            <w:tcW w:type="dxa" w:w="1813"/>
+            <w:vAlign w:val="center"/>
+            <w:noWrap/>
+          </w:tcPr>
+          <w:p>
+            <w:pPr>
+              <w:spacing w:before="60" w:after="60"/>
+              <w:jc w:val="center"/>
+            </w:pPr>
+            <w:r>
+              <w:rPr>
+                <w:sz w:val="16"/>
+              </w:rPr>
+              <w:t>0,22%</w:t>
             </w:r>
           </w:p>
         </w:tc>
@@ -9486,7 +9486,7 @@
               <w:rPr>
                 <w:sz w:val="16"/>
               </w:rPr>
-              <w:t>MPDFT</w:t>
+              <w:t>TRT11</w:t>
             </w:r>
           </w:p>
         </w:tc>
@@ -9543,26 +9543,26 @@
               <w:rPr>
                 <w:sz w:val="16"/>
               </w:rPr>
-              <w:t>907</w:t>
-            </w:r>
-          </w:p>
-        </w:tc>
-        <w:tc>
-          <w:tcPr>
-            <w:tcW w:type="dxa" w:w="1813"/>
-            <w:vAlign w:val="center"/>
-            <w:noWrap/>
-          </w:tcPr>
-          <w:p>
-            <w:pPr>
-              <w:spacing w:before="60" w:after="60"/>
-              <w:jc w:val="center"/>
-            </w:pPr>
-            <w:r>
-              <w:rPr>
-                <w:sz w:val="16"/>
-              </w:rPr>
-              <w:t>2,45%</w:t>
+              <w:t>270</w:t>
+            </w:r>
+          </w:p>
+        </w:tc>
+        <w:tc>
+          <w:tcPr>
+            <w:tcW w:type="dxa" w:w="1813"/>
+            <w:vAlign w:val="center"/>
+            <w:noWrap/>
+          </w:tcPr>
+          <w:p>
+            <w:pPr>
+              <w:spacing w:before="60" w:after="60"/>
+              <w:jc w:val="center"/>
+            </w:pPr>
+            <w:r>
+              <w:rPr>
+                <w:sz w:val="16"/>
+              </w:rPr>
+              <w:t>0,73%</w:t>
             </w:r>
           </w:p>
         </w:tc>
@@ -9583,7 +9583,7 @@
               <w:rPr>
                 <w:sz w:val="16"/>
               </w:rPr>
-              <w:t>TREAL</w:t>
+              <w:t>SJPI</w:t>
             </w:r>
           </w:p>
         </w:tc>
@@ -9640,26 +9640,26 @@
               <w:rPr>
                 <w:sz w:val="16"/>
               </w:rPr>
-              <w:t>37</w:t>
-            </w:r>
-          </w:p>
-        </w:tc>
-        <w:tc>
-          <w:tcPr>
-            <w:tcW w:type="dxa" w:w="1813"/>
-            <w:vAlign w:val="center"/>
-            <w:noWrap/>
-          </w:tcPr>
-          <w:p>
-            <w:pPr>
-              <w:spacing w:before="60" w:after="60"/>
-              <w:jc w:val="center"/>
-            </w:pPr>
-            <w:r>
-              <w:rPr>
-                <w:sz w:val="16"/>
-              </w:rPr>
-              <w:t>0,10%</w:t>
+              <w:t>72</w:t>
+            </w:r>
+          </w:p>
+        </w:tc>
+        <w:tc>
+          <w:tcPr>
+            <w:tcW w:type="dxa" w:w="1813"/>
+            <w:vAlign w:val="center"/>
+            <w:noWrap/>
+          </w:tcPr>
+          <w:p>
+            <w:pPr>
+              <w:spacing w:before="60" w:after="60"/>
+              <w:jc w:val="center"/>
+            </w:pPr>
+            <w:r>
+              <w:rPr>
+                <w:sz w:val="16"/>
+              </w:rPr>
+              <w:t>0,19%</w:t>
             </w:r>
           </w:p>
         </w:tc>
@@ -10658,7 +10658,7 @@
         <w:pStyle w:val="CorpoComRecuo"/>
       </w:pPr>
       <w:r>
-        <w:t xml:space="preserve">Em setembro/2025, o perfil de tributação demonstra a preferência de 3% dos participantes pelo regime regressivo (Gráfico 4). </w:t>
+        <w:t xml:space="preserve">Em setembro/2025, o perfil de tributação demonstra a preferência de 4% dos participantes pelo regime regressivo (Gráfico 4). </w:t>
       </w:r>
     </w:p>
     <w:p>
@@ -10813,7 +10813,7 @@
         <w:pStyle w:val="CorpoComRecuo"/>
       </w:pPr>
       <w:r>
-        <w:t>Para os participantes patrocinados a opção mais vantajosa é contribuir com o percentual máximo (8,5%), obtendo a contrapartida máxima da contribuição patronal. Em setembro/2025, 87,06% dos participantes optaram pelo percentual máximo. Já no acumulado, desde o início do plano, temos 91,53% dos participantes com o percentual de 8,5%.</w:t>
+        <w:t>Para os participantes patrocinados a opção mais vantajosa é contribuir com o percentual máximo (8,5%), obtendo a contrapartida máxima da contribuição patronal. Em setembro/2025, 87,06% dos participantes optaram pelo percentual máximo. Já no acumulado, desde o início do plano, temos 91,54% dos participantes com o percentual de 8,5%.</w:t>
       </w:r>
     </w:p>
     <w:p>
@@ -10902,7 +10902,7 @@
         <w:pStyle w:val="CorpoComRecuo"/>
       </w:pPr>
       <w:r>
-        <w:t>A arrecadação das contribuições no mês de setembro/2025 atingiu o valor de R$ 75.8 milhões. Foram arrecadados aproximadamente R$ 2.8 milhões referente a contribuições de outras competências.</w:t>
+        <w:t>A arrecadação das contribuições no mês de setembro/2025 atingiu o valor de R$ 78.5 milhões. Foram arrecadados aproximadamente R$ 4237.6 milhões referente a contribuições de outras competências.</w:t>
       </w:r>
     </w:p>
     <w:p>
@@ -10912,7 +10912,7 @@
       <w:r>
         <w:drawing>
           <wp:inline xmlns:a="http://schemas.openxmlformats.org/drawingml/2006/main" xmlns:pic="http://schemas.openxmlformats.org/drawingml/2006/picture">
-            <wp:extent cx="3657600" cy="1322832"/>
+            <wp:extent cx="3657600" cy="1097280"/>
             <wp:docPr id="19" name="Picture 19"/>
             <wp:cNvGraphicFramePr>
               <a:graphicFrameLocks noChangeAspect="1"/>
@@ -10933,7 +10933,7 @@
                   <pic:spPr>
                     <a:xfrm>
                       <a:off x="0" y="0"/>
-                      <a:ext cx="3657600" cy="1322832"/>
+                      <a:ext cx="3657600" cy="1097280"/>
                     </a:xfrm>
                     <a:prstGeom prst="rect"/>
                   </pic:spPr>
@@ -11135,7 +11135,7 @@
       <w:r>
         <w:drawing>
           <wp:inline xmlns:a="http://schemas.openxmlformats.org/drawingml/2006/main" xmlns:pic="http://schemas.openxmlformats.org/drawingml/2006/picture">
-            <wp:extent cx="5669280" cy="2334796"/>
+            <wp:extent cx="5669280" cy="2334797"/>
             <wp:docPr id="22" name="Picture 22"/>
             <wp:cNvGraphicFramePr>
               <a:graphicFrameLocks noChangeAspect="1"/>
@@ -11156,7 +11156,7 @@
                   <pic:spPr>
                     <a:xfrm>
                       <a:off x="0" y="0"/>
-                      <a:ext cx="5669280" cy="2334796"/>
+                      <a:ext cx="5669280" cy="2334797"/>
                     </a:xfrm>
                     <a:prstGeom prst="rect"/>
                   </pic:spPr>

</xml_diff>